<commit_message>
Add generated documentation script and current outputs
</commit_message>
<xml_diff>
--- a/Abgabe/Dokumentation_Ballonfahrt_Leonardo_Freyhofer.docx
+++ b/Abgabe/Dokumentation_Ballonfahrt_Leonardo_Freyhofer.docx
@@ -4,7 +4,7 @@
   <w:body>
     <w:p>
       <w:pPr>
-        <w:spacing w:after="20" w:line="250" w:lineRule="auto"/>
+        <w:spacing w:after="60" w:line="250" w:lineRule="auto"/>
       </w:pPr>
       <w:r>
         <w:rPr>
@@ -13,7 +13,7 @@
           <w:color w:val="0B3D4A"/>
           <w:sz w:val="34"/>
         </w:rPr>
-        <w:t>Dokumentation zur Pr?sentationsleistung</w:t>
+        <w:t>Dokumentation zur Präsentationsleistung</w:t>
       </w:r>
     </w:p>
     <w:p>
@@ -34,7 +34,6 @@
       <w:tblPr>
         <w:tblW w:type="auto" w:w="0"/>
         <w:jc w:val="center"/>
-        <w:tblLayout w:type="fixed"/>
         <w:tblLook w:firstColumn="1" w:firstRow="1" w:lastColumn="0" w:lastRow="0" w:noHBand="0" w:noVBand="1" w:val="04A0"/>
       </w:tblPr>
       <w:tblGrid>
@@ -292,7 +291,7 @@
         <w:rPr>
           <w:rFonts w:ascii="Arial" w:hAnsi="Arial" w:eastAsia="Arial"/>
         </w:rPr>
-        <w:t>Gesucht ist eine Funktion dritten Grades, die die Horizontalgeschwindigkeit einer siebenst?ndigen Ballonfahrt beschreibt. Die Fahrtrichtung soll sich zweimal umkehren, der Landepunkt soll horizontal m?glichst nah am Startpunkt liegen und die Endgeschwindigkeit darf nicht 0 km/h sein.</w:t>
+        <w:t>Gesucht ist eine Funktion dritten Grades, die die Horizontalgeschwindigkeit einer siebenstündigen Ballonfahrt beschreibt. Die Fahrtrichtung soll sich zweimal umkehren, der Landepunkt soll horizontal möglichst nah am Startpunkt liegen und die Endgeschwindigkeit darf nicht 0 km/h sein.</w:t>
       </w:r>
     </w:p>
     <w:p>
@@ -303,7 +302,7 @@
         <w:rPr>
           <w:rFonts w:ascii="Arial" w:hAnsi="Arial" w:eastAsia="Arial"/>
         </w:rPr>
-        <w:t>F?r die Geschwindigkeit wird deshalb der Ansatz gew?hlt:</w:t>
+        <w:t>Für die Geschwindigkeit wird deshalb der Ansatz gewählt:</w:t>
       </w:r>
     </w:p>
     <w:p>
@@ -318,7 +317,7 @@
           <w:color w:val="0B3D4A"/>
           <w:sz w:val="21"/>
         </w:rPr>
-        <w:t>v(t) = k ? t ? (t - r) ? (t - s),      0 ? t ? 7</w:t>
+        <w:t>v(t) = k · t · (t - r) · (t - s),      0 ≤ t ≤ 7</w:t>
       </w:r>
     </w:p>
     <w:p>
@@ -331,7 +330,7 @@
           <w:rFonts w:ascii="Arial" w:hAnsi="Arial" w:eastAsia="Arial"/>
           <w:sz w:val="17"/>
         </w:rPr>
-        <w:t>? t = 0 beschreibt den Start der Fahrt.</w:t>
+        <w:t>• t = 0 beschreibt den Start der Fahrt.</w:t>
       </w:r>
     </w:p>
     <w:p>
@@ -344,7 +343,7 @@
           <w:rFonts w:ascii="Arial" w:hAnsi="Arial" w:eastAsia="Arial"/>
           <w:sz w:val="17"/>
         </w:rPr>
-        <w:t>? r und s sind die beiden Richtungswechsel, also Nullstellen innerhalb des Intervalls.</w:t>
+        <w:t>• r und s sind die beiden Richtungswechsel, also Nullstellen innerhalb des Intervalls.</w:t>
       </w:r>
     </w:p>
     <w:p>
@@ -357,7 +356,7 @@
           <w:rFonts w:ascii="Arial" w:hAnsi="Arial" w:eastAsia="Arial"/>
           <w:sz w:val="17"/>
         </w:rPr>
-        <w:t>? k ist ein Streckfaktor und legt die Gr??enordnung der Geschwindigkeiten fest.</w:t>
+        <w:t>• k ist ein Streckfaktor und legt die Größenordnung der Geschwindigkeiten fest.</w:t>
       </w:r>
     </w:p>
     <w:p>
@@ -380,7 +379,7 @@
         <w:rPr>
           <w:rFonts w:ascii="Arial" w:hAnsi="Arial" w:eastAsia="Arial"/>
         </w:rPr>
-        <w:t>Zun?chst wirkt r = 3 attraktiv. Aus der Bedingung f?r den Endabstand ergibt sich dann s = 6,3. Wenn anschlie?end k so gew?hlt wird, dass die lokale H?chstgeschwindigkeit 25 km/h betr?gt, entsteht jedoch v(7) ? 44,3 km/h. Diese Landegeschwindigkeit ist f?r eine Ballonfahrt zu hoch.</w:t>
+        <w:t>Zunächst wirkt r = 3 attraktiv. Aus der Bedingung für den Endabstand ergibt sich dann s = 6,3. Wenn anschließend k so gewählt wird, dass die lokale Höchstgeschwindigkeit 25 km/h beträgt, entsteht jedoch v(7) ≈ 44,3 km/h. Diese Landegeschwindigkeit ist für eine Ballonfahrt zu hoch.</w:t>
       </w:r>
     </w:p>
     <w:p>
@@ -443,7 +442,7 @@
         <w:rPr>
           <w:rFonts w:ascii="Arial" w:hAnsi="Arial" w:eastAsia="Arial"/>
         </w:rPr>
-        <w:t>Damit der Ballon horizontal wieder beim Startpunkt landet, muss die gesamte Orts?nderung null sein:</w:t>
+        <w:t>Damit der Ballon horizontal wieder beim Startpunkt landet, muss die gesamte Ortsänderung null sein:</w:t>
       </w:r>
     </w:p>
     <w:p>
@@ -458,7 +457,7 @@
           <w:color w:val="0B3D4A"/>
           <w:sz w:val="20"/>
         </w:rPr>
-        <w:t>??? v(t) dt = 0</w:t>
+        <w:t>∫₀⁷ v(t) dt = 0</w:t>
       </w:r>
     </w:p>
     <w:p>
@@ -469,7 +468,7 @@
         <w:rPr>
           <w:rFonts w:ascii="Arial" w:hAnsi="Arial" w:eastAsia="Arial"/>
         </w:rPr>
-        <w:t>Der Faktor k kann dabei zun?chst weggelassen werden, weil er das Integral nur skaliert. F?r t ? (t-r) ? (t-s) gilt:</w:t>
+        <w:t>Der Faktor k kann dabei zunächst weggelassen werden, weil er das Integral nur skaliert. Für t · (t-r) · (t-s) gilt:</w:t>
       </w:r>
     </w:p>
     <w:p>
@@ -482,7 +481,7 @@
           <w:rFonts w:ascii="Arial" w:hAnsi="Arial" w:eastAsia="Arial"/>
           <w:sz w:val="17"/>
         </w:rPr>
-        <w:t>??? t(t-r)(t-s) dt = [t?/4 - (r+s)t?/3 + rs?t?/2]?? = 0</w:t>
+        <w:t>∫₀⁷ t(t-r)(t-s) dt = [t⁴/4 - (r+s)t³/3 + rs·t²/2]₀⁷ = 0</w:t>
       </w:r>
     </w:p>
     <w:p>
@@ -493,7 +492,7 @@
         <w:rPr>
           <w:rFonts w:ascii="Arial" w:hAnsi="Arial" w:eastAsia="Arial"/>
         </w:rPr>
-        <w:t>Wir w?hlen r = 3,4 h, damit die sp?tere Landegeschwindigkeit kleiner wird. Daraus folgt:</w:t>
+        <w:t>Wir wählen r = 3,4 h, damit die spätere Landegeschwindigkeit kleiner wird. Daraus folgt:</w:t>
       </w:r>
     </w:p>
     <w:p>
@@ -508,7 +507,7 @@
           <w:color w:val="0B3D4A"/>
           <w:sz w:val="18"/>
         </w:rPr>
-        <w:t>s = ((343r/3) - (2401/4)) / ((49r/2) - (343/3)) ? 6,81579</w:t>
+        <w:t>s = ((343r/3) - (2401/4)) / ((49r/2) - (343/3)) ≈ 6,81579</w:t>
       </w:r>
     </w:p>
     <w:p>
@@ -536,7 +535,7 @@
         <w:rPr>
           <w:rFonts w:ascii="Arial" w:hAnsi="Arial" w:eastAsia="Arial"/>
         </w:rPr>
-        <w:t>Der Streckfaktor wird nun so bestimmt, dass der lokale Hochpunkt genau 25 km/h betr?gt. Damit ergibt sich als finales Modell:</w:t>
+        <w:t>Der Streckfaktor wird nun so bestimmt, dass der lokale Hochpunkt genau 25 km/h beträgt. Damit ergibt sich als finales Modell:</w:t>
       </w:r>
     </w:p>
     <w:p>
@@ -551,7 +550,7 @@
           <w:color w:val="0B3D4A"/>
           <w:sz w:val="24"/>
         </w:rPr>
-        <w:t>v(t) ? 1,648 ? t ? (t - 3,4) ? (t - 6,81579)</w:t>
+        <w:t>v(t) ≈ 1,648 · t · (t - 3,4) · (t - 6,81579)</w:t>
       </w:r>
     </w:p>
     <w:tbl>
@@ -814,7 +813,7 @@
                 <w:color w:val="000000"/>
                 <w:sz w:val="15"/>
               </w:rPr>
-              <w:t>v(7) ? 7,6 km/h</w:t>
+              <w:t>v(7) ≈ 7,6 km/h</w:t>
             </w:r>
           </w:p>
         </w:tc>
@@ -896,7 +895,7 @@
         <w:rPr>
           <w:rFonts w:ascii="Arial" w:hAnsi="Arial" w:eastAsia="Arial"/>
         </w:rPr>
-        <w:t>5. Stammfunktion und r?umliche Erweiterung</w:t>
+        <w:t>5. Stammfunktion und räumliche Erweiterung</w:t>
       </w:r>
     </w:p>
     <w:p>
@@ -907,7 +906,7 @@
         <w:rPr>
           <w:rFonts w:ascii="Arial" w:hAnsi="Arial" w:eastAsia="Arial"/>
         </w:rPr>
-        <w:t>Die Stammfunktion S(t)=?v(t)dt beschreibt den horizontalen Abstand vom Startpunkt. Weil S(0)=0 und S(7)=0 gilt, liegt der Landepunkt horizontal wieder beim Startpunkt. F?r die z-Achse wird eine H?henfunktion erg?nzt; die Zeit bleibt dabei nur der Parameter der Kurve.</w:t>
+        <w:t>Die Stammfunktion S(t)=∫v(t)dt beschreibt den horizontalen Abstand vom Startpunkt. Weil S(0)=0 und S(7)=0 gilt, liegt der Landepunkt horizontal wieder beim Startpunkt. Für die z-Achse wird eine Höhenfunktion ergänzt; die Zeit bleibt dabei nur der Parameter der Kurve.</w:t>
       </w:r>
     </w:p>
     <w:tbl>
@@ -1032,7 +1031,7 @@
           <w:rFonts w:ascii="Arial" w:hAnsi="Arial" w:eastAsia="Arial"/>
           <w:sz w:val="17"/>
         </w:rPr>
-        <w:t>Die Landefl?che liegt in der Bodenebene z = 0. Sie wird als gleichseitiges Dreieck konstruiert; Start- und Landepunkt sind sein Zentrum und damit ausdr?cklich kein Eckpunkt.</w:t>
+        <w:t>Die Landefläche liegt in der Bodenebene z = 0. Sie wird als gleichseitiges Dreieck konstruiert; Start- und Landepunkt sind sein Zentrum und damit ausdrücklich kein Eckpunkt.</w:t>
       </w:r>
     </w:p>
     <w:p>
@@ -1046,7 +1045,7 @@
           <w:color w:val="0B3D4A"/>
           <w:sz w:val="18"/>
         </w:rPr>
-        <w:t>Fazit: Das Modell erf?llt die Bedingungen der Aufgabe und ist realistischer als die glatte Ausgangsvariante, weil die Landegeschwindigkeit deutlich unter der sonstigen H?chstgeschwindigkeit liegt.</w:t>
+        <w:t>Fazit: Das Modell erfüllt die Bedingungen der Aufgabe und ist realistischer als die glatte Ausgangsvariante, weil die Landegeschwindigkeit deutlich unter der sonstigen Höchstgeschwindigkeit liegt.</w:t>
       </w:r>
     </w:p>
     <w:p>
@@ -1085,7 +1084,7 @@
         <w:color w:val="666666"/>
         <w:sz w:val="15"/>
       </w:rPr>
-      <w:t>Dokumentation Ballonfahrt-Modell ? Leonardo Freyhofer</w:t>
+      <w:t>Dokumentation Ballonfahrt-Modell – Leonardo Freyhofer</w:t>
     </w:r>
   </w:p>
 </w:ftr>

</xml_diff>